<commit_message>
Update resume file and add Tráfego de Alta Performance course
</commit_message>
<xml_diff>
--- a/Curriculo_Kauany_Caetano_Marketing_e_Growth.docx
+++ b/Curriculo_Kauany_Caetano_Marketing_e_Growth.docx
@@ -2362,7 +2362,15 @@
         </w:numPr>
       </w:pPr>
       <w:r>
-        <w:t xml:space="preserve">Análise de dados, resolução de problemas e </w:t>
+        <w:t xml:space="preserve">Análise de dados, resolução de </w:t>
+      </w:r>
+      <w:proofErr w:type="spellStart"/>
+      <w:r>
+        <w:t>problemas</w:t>
+      </w:r>
+      <w:proofErr w:type="spellEnd"/>
+      <w:r>
+        <w:t xml:space="preserve"> e </w:t>
       </w:r>
       <w:proofErr w:type="spellStart"/>
       <w:r>
@@ -2642,7 +2650,15 @@
         </w:numPr>
       </w:pPr>
       <w:r>
-        <w:t xml:space="preserve">Revisão de documentos e </w:t>
+        <w:t xml:space="preserve">Revisão de </w:t>
+      </w:r>
+      <w:proofErr w:type="spellStart"/>
+      <w:r>
+        <w:t>documentos</w:t>
+      </w:r>
+      <w:proofErr w:type="spellEnd"/>
+      <w:r>
+        <w:t xml:space="preserve"> e </w:t>
       </w:r>
       <w:proofErr w:type="spellStart"/>
       <w:r>
@@ -2724,7 +2740,15 @@
       </w:r>
       <w:proofErr w:type="spellEnd"/>
       <w:r>
-        <w:t xml:space="preserve"> Nove de Julho (UNINOVE)</w:t>
+        <w:t xml:space="preserve"> Nove de </w:t>
+      </w:r>
+      <w:proofErr w:type="spellStart"/>
+      <w:r>
+        <w:t>Julho</w:t>
+      </w:r>
+      <w:proofErr w:type="spellEnd"/>
+      <w:r>
+        <w:t xml:space="preserve"> (UNINOVE)</w:t>
       </w:r>
       <w:r>
         <w:br/>
@@ -2783,8 +2807,56 @@
           <w:numId w:val="21"/>
         </w:numPr>
       </w:pPr>
-      <w:r>
-        <w:t xml:space="preserve">Gestor de Tráfego Pago e Mídia Performance — Udemy </w:t>
+      <w:proofErr w:type="spellStart"/>
+      <w:r>
+        <w:t>T</w:t>
+      </w:r>
+      <w:r>
+        <w:t>ráfego</w:t>
+      </w:r>
+      <w:proofErr w:type="spellEnd"/>
+      <w:r>
+        <w:t xml:space="preserve"> de Alta Performance</w:t>
+      </w:r>
+      <w:r>
+        <w:t xml:space="preserve"> -</w:t>
+      </w:r>
+      <w:r>
+        <w:t xml:space="preserve"> Google Ads e Meta Ads </w:t>
+      </w:r>
+      <w:proofErr w:type="spellStart"/>
+      <w:r>
+        <w:t>Avançado</w:t>
+      </w:r>
+      <w:proofErr w:type="spellEnd"/>
+      <w:r>
+        <w:t xml:space="preserve"> </w:t>
+      </w:r>
+      <w:r>
+        <w:t xml:space="preserve">— </w:t>
+      </w:r>
+      <w:r>
+        <w:t>Expert Digital</w:t>
+      </w:r>
+    </w:p>
+    <w:p>
+      <w:pPr>
+        <w:pStyle w:val="Commarcadores"/>
+        <w:numPr>
+          <w:ilvl w:val="0"/>
+          <w:numId w:val="21"/>
+        </w:numPr>
+      </w:pPr>
+      <w:r>
+        <w:t xml:space="preserve">Gestor de </w:t>
+      </w:r>
+      <w:proofErr w:type="spellStart"/>
+      <w:r>
+        <w:t>Tráfego</w:t>
+      </w:r>
+      <w:proofErr w:type="spellEnd"/>
+      <w:r>
+        <w:t xml:space="preserve"> Pago e Mídia Performance — Udemy </w:t>
       </w:r>
     </w:p>
     <w:p>
@@ -3084,7 +3156,7 @@
   <w:abstractNum w:abstractNumId="8" w15:restartNumberingAfterBreak="0">
     <w:nsid w:val="FFFFFF89"/>
     <w:multiLevelType w:val="singleLevel"/>
-    <w:tmpl w:val="917CAE16"/>
+    <w:tmpl w:val="B28AF1FE"/>
     <w:lvl w:ilvl="0">
       <w:start w:val="1"/>
       <w:numFmt w:val="bullet"/>
@@ -5166,7 +5238,6 @@
   <w:style w:type="character" w:default="1" w:styleId="Fontepargpadro">
     <w:name w:val="Default Paragraph Font"/>
     <w:uiPriority w:val="1"/>
-    <w:semiHidden/>
     <w:unhideWhenUsed/>
   </w:style>
   <w:style w:type="table" w:default="1" w:styleId="Tabelanormal">

</xml_diff>

<commit_message>
Add branded K favicon and subtle scroll-reveal animations
Replaces the generic emoji favicon with a monogram in the site's accent color across all pages, and adds a lightweight IntersectionObserver-based fade/slide-in for cards, project blocks and timeline items as they scroll into view (respects prefers-reduced-motion). Also syncs the latest resume file and the first logo added to the new companies folder.
</commit_message>
<xml_diff>
--- a/Curriculo_Kauany_Caetano_Marketing_e_Growth.docx
+++ b/Curriculo_Kauany_Caetano_Marketing_e_Growth.docx
@@ -2362,7 +2362,15 @@
         </w:numPr>
       </w:pPr>
       <w:r>
-        <w:t xml:space="preserve">Análise de dados, resolução de </w:t>
+        <w:t xml:space="preserve">Análise de dados, </w:t>
+      </w:r>
+      <w:proofErr w:type="spellStart"/>
+      <w:r>
+        <w:t>resolução</w:t>
+      </w:r>
+      <w:proofErr w:type="spellEnd"/>
+      <w:r>
+        <w:t xml:space="preserve"> de </w:t>
       </w:r>
       <w:proofErr w:type="spellStart"/>
       <w:r>
@@ -2409,6 +2417,16 @@
     </w:p>
     <w:p>
       <w:pPr>
+        <w:pStyle w:val="Commarcadores"/>
+        <w:numPr>
+          <w:ilvl w:val="0"/>
+          <w:numId w:val="0"/>
+        </w:numPr>
+        <w:ind w:left="720"/>
+      </w:pPr>
+    </w:p>
+    <w:p>
+      <w:pPr>
         <w:pStyle w:val="Ttulo3"/>
         <w:rPr>
           <w:sz w:val="26"/>
@@ -2420,6 +2438,7 @@
           <w:sz w:val="26"/>
           <w:szCs w:val="26"/>
         </w:rPr>
+        <w:lastRenderedPageBreak/>
         <w:t>SAC &amp; Auxiliar Administrativo | Syn Prop Tech – Tietê Plaza Shopping</w:t>
       </w:r>
     </w:p>
@@ -2461,7 +2480,6 @@
           <w:rFonts w:asciiTheme="majorHAnsi" w:eastAsia="Times New Roman" w:hAnsiTheme="majorHAnsi" w:cstheme="majorHAnsi"/>
           <w:lang w:val="pt-BR" w:eastAsia="pt-BR"/>
         </w:rPr>
-        <w:lastRenderedPageBreak/>
         <w:t xml:space="preserve">Gestão das demandas do SAC - Serviço de Atendimento ao Consumidor, atuando na análise, acompanhamento e resolução de ocorrências. </w:t>
       </w:r>
     </w:p>
@@ -2649,8 +2667,13 @@
           <w:numId w:val="19"/>
         </w:numPr>
       </w:pPr>
-      <w:r>
-        <w:t xml:space="preserve">Revisão de </w:t>
+      <w:proofErr w:type="spellStart"/>
+      <w:r>
+        <w:t>Revisão</w:t>
+      </w:r>
+      <w:proofErr w:type="spellEnd"/>
+      <w:r>
+        <w:t xml:space="preserve"> de </w:t>
       </w:r>
       <w:proofErr w:type="spellStart"/>
       <w:r>
@@ -2830,10 +2853,7 @@
       </w:r>
       <w:proofErr w:type="spellEnd"/>
       <w:r>
-        <w:t xml:space="preserve"> </w:t>
-      </w:r>
-      <w:r>
-        <w:t xml:space="preserve">— </w:t>
+        <w:t xml:space="preserve"> — </w:t>
       </w:r>
       <w:r>
         <w:t>Expert Digital</w:t>
@@ -2856,7 +2876,15 @@
       </w:r>
       <w:proofErr w:type="spellEnd"/>
       <w:r>
-        <w:t xml:space="preserve"> Pago e Mídia Performance — Udemy </w:t>
+        <w:t xml:space="preserve"> Pago e </w:t>
+      </w:r>
+      <w:proofErr w:type="spellStart"/>
+      <w:r>
+        <w:t>Mídia</w:t>
+      </w:r>
+      <w:proofErr w:type="spellEnd"/>
+      <w:r>
+        <w:t xml:space="preserve"> Performance — Udemy </w:t>
       </w:r>
     </w:p>
     <w:p>
@@ -5238,6 +5266,7 @@
   <w:style w:type="character" w:default="1" w:styleId="Fontepargpadro">
     <w:name w:val="Default Paragraph Font"/>
     <w:uiPriority w:val="1"/>
+    <w:semiHidden/>
     <w:unhideWhenUsed/>
   </w:style>
   <w:style w:type="table" w:default="1" w:styleId="Tabelanormal">

</xml_diff>